<commit_message>
3d lab2: step 2
</commit_message>
<xml_diff>
--- a/4/3d_modeling/lab2/lab.docx
+++ b/4/3d_modeling/lab2/lab.docx
@@ -74,13 +74,8 @@
         <w:pStyle w:val="a2"/>
       </w:pPr>
       <w:r>
-        <w:t xml:space="preserve">9 </w:t>
-      </w:r>
-      <w:proofErr w:type="spellStart"/>
-      <w:r>
-        <w:t>шт</w:t>
-      </w:r>
-      <w:proofErr w:type="spellEnd"/>
+        <w:t>9 шт</w:t>
+      </w:r>
     </w:p>
     <w:p>
       <w:pPr>
@@ -272,34 +267,51 @@
         <w:pStyle w:val="a2"/>
       </w:pPr>
       <w:r>
-        <w:t xml:space="preserve">Фундамент создаётся при помощи инструментов </w:t>
-      </w:r>
-      <w:proofErr w:type="spellStart"/>
-      <w:r>
-        <w:t>Extrude</w:t>
-      </w:r>
-      <w:proofErr w:type="spellEnd"/>
-      <w:r>
-        <w:t xml:space="preserve">, </w:t>
-      </w:r>
-      <w:proofErr w:type="spellStart"/>
-      <w:r>
-        <w:t>Scale</w:t>
-      </w:r>
-      <w:proofErr w:type="spellEnd"/>
-      <w:r>
-        <w:t xml:space="preserve"> и </w:t>
-      </w:r>
-      <w:proofErr w:type="spellStart"/>
-      <w:r>
-        <w:t>Fill</w:t>
-      </w:r>
-      <w:proofErr w:type="spellEnd"/>
-      <w:r>
-        <w:t>, итоговый результат на рис 2.</w:t>
-      </w:r>
-    </w:p>
-    <w:p/>
+        <w:t>Фундамент создаётся при помощи инструментов Extrude, Scale и Fill, итоговый результат на рис 2.</w:t>
+      </w:r>
+    </w:p>
+    <w:p>
+      <w:r>
+        <w:rPr>
+          <w:noProof/>
+        </w:rPr>
+        <w:drawing>
+          <wp:inline distT="0" distB="0" distL="0" distR="0" wp14:anchorId="418ED59F" wp14:editId="5BB61F35">
+            <wp:extent cx="6152515" cy="3307080"/>
+            <wp:effectExtent l="0" t="0" r="635" b="7620"/>
+            <wp:docPr id="3" name="Рисунок 3"/>
+            <wp:cNvGraphicFramePr>
+              <a:graphicFrameLocks xmlns:a="http://schemas.openxmlformats.org/drawingml/2006/main" noChangeAspect="1"/>
+            </wp:cNvGraphicFramePr>
+            <a:graphic xmlns:a="http://schemas.openxmlformats.org/drawingml/2006/main">
+              <a:graphicData uri="http://schemas.openxmlformats.org/drawingml/2006/picture">
+                <pic:pic xmlns:pic="http://schemas.openxmlformats.org/drawingml/2006/picture">
+                  <pic:nvPicPr>
+                    <pic:cNvPr id="1" name=""/>
+                    <pic:cNvPicPr/>
+                  </pic:nvPicPr>
+                  <pic:blipFill>
+                    <a:blip r:embed="rId10"/>
+                    <a:stretch>
+                      <a:fillRect/>
+                    </a:stretch>
+                  </pic:blipFill>
+                  <pic:spPr>
+                    <a:xfrm>
+                      <a:off x="0" y="0"/>
+                      <a:ext cx="6152515" cy="3307080"/>
+                    </a:xfrm>
+                    <a:prstGeom prst="rect">
+                      <a:avLst/>
+                    </a:prstGeom>
+                  </pic:spPr>
+                </pic:pic>
+              </a:graphicData>
+            </a:graphic>
+          </wp:inline>
+        </w:drawing>
+      </w:r>
+    </w:p>
     <w:p>
       <w:pPr>
         <w:pStyle w:val="1"/>
@@ -318,6 +330,7 @@
         <w:pStyle w:val="1"/>
       </w:pPr>
       <w:r>
+        <w:lastRenderedPageBreak/>
         <w:t>Как создать массив копий объекта</w:t>
       </w:r>
     </w:p>
@@ -360,15 +373,7 @@
         </w:rPr>
       </w:pPr>
       <w:r>
-        <w:t xml:space="preserve">Цоколь и фасад здания были созданы из окружностей путём экструзии рёбер вдоль оси Z. Стенкам фасада придана толщина с помощью модификатора </w:t>
-      </w:r>
-      <w:proofErr w:type="spellStart"/>
-      <w:r>
-        <w:t>Solidify</w:t>
-      </w:r>
-      <w:proofErr w:type="spellEnd"/>
-      <w:r>
-        <w:t>. Затем фасад установлен на цоколь через привязку по полигонам (рис. №).</w:t>
+        <w:t>Цоколь и фасад здания были созданы из окружностей путём экструзии рёбер вдоль оси Z. Стенкам фасада придана толщина с помощью модификатора Solidify. Затем фасад установлен на цоколь через привязку по полигонам (рис. №).</w:t>
       </w:r>
     </w:p>
     <w:p>

</xml_diff>

<commit_message>
3d lab2: step 3
</commit_message>
<xml_diff>
--- a/4/3d_modeling/lab2/lab.docx
+++ b/4/3d_modeling/lab2/lab.docx
@@ -271,6 +271,11 @@
       </w:r>
     </w:p>
     <w:p>
+      <w:pPr>
+        <w:rPr>
+          <w:lang w:val="en-US"/>
+        </w:rPr>
+      </w:pPr>
       <w:r>
         <w:rPr>
           <w:noProof/>
@@ -314,6 +319,54 @@
     </w:p>
     <w:p>
       <w:pPr>
+        <w:rPr>
+          <w:lang w:val="en-US"/>
+        </w:rPr>
+      </w:pPr>
+      <w:r>
+        <w:rPr>
+          <w:noProof/>
+        </w:rPr>
+        <w:lastRenderedPageBreak/>
+        <w:drawing>
+          <wp:inline distT="0" distB="0" distL="0" distR="0" wp14:anchorId="6340C4ED" wp14:editId="2B9CC32E">
+            <wp:extent cx="6152515" cy="3307080"/>
+            <wp:effectExtent l="0" t="0" r="635" b="7620"/>
+            <wp:docPr id="4" name="Рисунок 4"/>
+            <wp:cNvGraphicFramePr>
+              <a:graphicFrameLocks xmlns:a="http://schemas.openxmlformats.org/drawingml/2006/main" noChangeAspect="1"/>
+            </wp:cNvGraphicFramePr>
+            <a:graphic xmlns:a="http://schemas.openxmlformats.org/drawingml/2006/main">
+              <a:graphicData uri="http://schemas.openxmlformats.org/drawingml/2006/picture">
+                <pic:pic xmlns:pic="http://schemas.openxmlformats.org/drawingml/2006/picture">
+                  <pic:nvPicPr>
+                    <pic:cNvPr id="1" name=""/>
+                    <pic:cNvPicPr/>
+                  </pic:nvPicPr>
+                  <pic:blipFill>
+                    <a:blip r:embed="rId11"/>
+                    <a:stretch>
+                      <a:fillRect/>
+                    </a:stretch>
+                  </pic:blipFill>
+                  <pic:spPr>
+                    <a:xfrm>
+                      <a:off x="0" y="0"/>
+                      <a:ext cx="6152515" cy="3307080"/>
+                    </a:xfrm>
+                    <a:prstGeom prst="rect">
+                      <a:avLst/>
+                    </a:prstGeom>
+                  </pic:spPr>
+                </pic:pic>
+              </a:graphicData>
+            </a:graphic>
+          </wp:inline>
+        </w:drawing>
+      </w:r>
+    </w:p>
+    <w:p>
+      <w:pPr>
         <w:pStyle w:val="1"/>
       </w:pPr>
       <w:r>
@@ -330,7 +383,6 @@
         <w:pStyle w:val="1"/>
       </w:pPr>
       <w:r>
-        <w:lastRenderedPageBreak/>
         <w:t>Как создать массив копий объекта</w:t>
       </w:r>
     </w:p>

</xml_diff>

<commit_message>
3d lab2: step 4
</commit_message>
<xml_diff>
--- a/4/3d_modeling/lab2/lab.docx
+++ b/4/3d_modeling/lab2/lab.docx
@@ -367,6 +367,60 @@
     </w:p>
     <w:p>
       <w:pPr>
+        <w:rPr>
+          <w:lang w:val="en-US"/>
+        </w:rPr>
+      </w:pPr>
+      <w:r>
+        <w:rPr>
+          <w:noProof/>
+        </w:rPr>
+        <w:drawing>
+          <wp:inline distT="0" distB="0" distL="0" distR="0" wp14:anchorId="6E2715B2" wp14:editId="3DCFCE82">
+            <wp:extent cx="6152515" cy="3308350"/>
+            <wp:effectExtent l="0" t="0" r="635" b="6350"/>
+            <wp:docPr id="5" name="Рисунок 5"/>
+            <wp:cNvGraphicFramePr>
+              <a:graphicFrameLocks xmlns:a="http://schemas.openxmlformats.org/drawingml/2006/main" noChangeAspect="1"/>
+            </wp:cNvGraphicFramePr>
+            <a:graphic xmlns:a="http://schemas.openxmlformats.org/drawingml/2006/main">
+              <a:graphicData uri="http://schemas.openxmlformats.org/drawingml/2006/picture">
+                <pic:pic xmlns:pic="http://schemas.openxmlformats.org/drawingml/2006/picture">
+                  <pic:nvPicPr>
+                    <pic:cNvPr id="1" name=""/>
+                    <pic:cNvPicPr/>
+                  </pic:nvPicPr>
+                  <pic:blipFill>
+                    <a:blip r:embed="rId12"/>
+                    <a:stretch>
+                      <a:fillRect/>
+                    </a:stretch>
+                  </pic:blipFill>
+                  <pic:spPr>
+                    <a:xfrm>
+                      <a:off x="0" y="0"/>
+                      <a:ext cx="6152515" cy="3308350"/>
+                    </a:xfrm>
+                    <a:prstGeom prst="rect">
+                      <a:avLst/>
+                    </a:prstGeom>
+                  </pic:spPr>
+                </pic:pic>
+              </a:graphicData>
+            </a:graphic>
+          </wp:inline>
+        </w:drawing>
+      </w:r>
+    </w:p>
+    <w:p>
+      <w:pPr>
+        <w:rPr>
+          <w:lang w:val="en-US"/>
+        </w:rPr>
+      </w:pPr>
+    </w:p>
+    <w:p>
+      <w:pPr>
         <w:pStyle w:val="1"/>
       </w:pPr>
       <w:r>
@@ -396,6 +450,7 @@
         <w:pStyle w:val="1"/>
       </w:pPr>
       <w:r>
+        <w:lastRenderedPageBreak/>
         <w:t>Скриншот результатов быстрой визуализации (рендера)</w:t>
       </w:r>
     </w:p>

</xml_diff>

<commit_message>
3d lab2: step 5
</commit_message>
<xml_diff>
--- a/4/3d_modeling/lab2/lab.docx
+++ b/4/3d_modeling/lab2/lab.docx
@@ -413,11 +413,89 @@
       </w:r>
     </w:p>
     <w:p>
-      <w:pPr>
+      <w:r>
         <w:rPr>
-          <w:lang w:val="en-US"/>
+          <w:noProof/>
         </w:rPr>
-      </w:pPr>
+        <w:lastRenderedPageBreak/>
+        <w:drawing>
+          <wp:inline distT="0" distB="0" distL="0" distR="0" wp14:anchorId="603A4CAD" wp14:editId="71F4D939">
+            <wp:extent cx="6152515" cy="3308350"/>
+            <wp:effectExtent l="0" t="0" r="635" b="6350"/>
+            <wp:docPr id="6" name="Рисунок 6"/>
+            <wp:cNvGraphicFramePr>
+              <a:graphicFrameLocks xmlns:a="http://schemas.openxmlformats.org/drawingml/2006/main" noChangeAspect="1"/>
+            </wp:cNvGraphicFramePr>
+            <a:graphic xmlns:a="http://schemas.openxmlformats.org/drawingml/2006/main">
+              <a:graphicData uri="http://schemas.openxmlformats.org/drawingml/2006/picture">
+                <pic:pic xmlns:pic="http://schemas.openxmlformats.org/drawingml/2006/picture">
+                  <pic:nvPicPr>
+                    <pic:cNvPr id="1" name=""/>
+                    <pic:cNvPicPr/>
+                  </pic:nvPicPr>
+                  <pic:blipFill>
+                    <a:blip r:embed="rId13"/>
+                    <a:stretch>
+                      <a:fillRect/>
+                    </a:stretch>
+                  </pic:blipFill>
+                  <pic:spPr>
+                    <a:xfrm>
+                      <a:off x="0" y="0"/>
+                      <a:ext cx="6152515" cy="3308350"/>
+                    </a:xfrm>
+                    <a:prstGeom prst="rect">
+                      <a:avLst/>
+                    </a:prstGeom>
+                  </pic:spPr>
+                </pic:pic>
+              </a:graphicData>
+            </a:graphic>
+          </wp:inline>
+        </w:drawing>
+      </w:r>
+    </w:p>
+    <w:p>
+      <w:r>
+        <w:rPr>
+          <w:noProof/>
+        </w:rPr>
+        <w:drawing>
+          <wp:inline distT="0" distB="0" distL="0" distR="0" wp14:anchorId="6E78F119" wp14:editId="69DB0AF2">
+            <wp:extent cx="6152515" cy="3308350"/>
+            <wp:effectExtent l="0" t="0" r="635" b="6350"/>
+            <wp:docPr id="7" name="Рисунок 7"/>
+            <wp:cNvGraphicFramePr>
+              <a:graphicFrameLocks xmlns:a="http://schemas.openxmlformats.org/drawingml/2006/main" noChangeAspect="1"/>
+            </wp:cNvGraphicFramePr>
+            <a:graphic xmlns:a="http://schemas.openxmlformats.org/drawingml/2006/main">
+              <a:graphicData uri="http://schemas.openxmlformats.org/drawingml/2006/picture">
+                <pic:pic xmlns:pic="http://schemas.openxmlformats.org/drawingml/2006/picture">
+                  <pic:nvPicPr>
+                    <pic:cNvPr id="1" name=""/>
+                    <pic:cNvPicPr/>
+                  </pic:nvPicPr>
+                  <pic:blipFill>
+                    <a:blip r:embed="rId14"/>
+                    <a:stretch>
+                      <a:fillRect/>
+                    </a:stretch>
+                  </pic:blipFill>
+                  <pic:spPr>
+                    <a:xfrm>
+                      <a:off x="0" y="0"/>
+                      <a:ext cx="6152515" cy="3308350"/>
+                    </a:xfrm>
+                    <a:prstGeom prst="rect">
+                      <a:avLst/>
+                    </a:prstGeom>
+                  </pic:spPr>
+                </pic:pic>
+              </a:graphicData>
+            </a:graphic>
+          </wp:inline>
+        </w:drawing>
+      </w:r>
     </w:p>
     <w:p>
       <w:pPr>
@@ -450,7 +528,6 @@
         <w:pStyle w:val="1"/>
       </w:pPr>
       <w:r>
-        <w:lastRenderedPageBreak/>
         <w:t>Скриншот результатов быстрой визуализации (рендера)</w:t>
       </w:r>
     </w:p>

</xml_diff>

<commit_message>
3d lab2: step 6
</commit_message>
<xml_diff>
--- a/4/3d_modeling/lab2/lab.docx
+++ b/4/3d_modeling/lab2/lab.docx
@@ -74,8 +74,13 @@
         <w:pStyle w:val="a2"/>
       </w:pPr>
       <w:r>
-        <w:t>9 шт</w:t>
-      </w:r>
+        <w:t xml:space="preserve">9 </w:t>
+      </w:r>
+      <w:proofErr w:type="spellStart"/>
+      <w:r>
+        <w:t>шт</w:t>
+      </w:r>
+      <w:proofErr w:type="spellEnd"/>
     </w:p>
     <w:p>
       <w:pPr>
@@ -267,7 +272,31 @@
         <w:pStyle w:val="a2"/>
       </w:pPr>
       <w:r>
-        <w:t>Фундамент создаётся при помощи инструментов Extrude, Scale и Fill, итоговый результат на рис 2.</w:t>
+        <w:t xml:space="preserve">Фундамент создаётся при помощи инструментов </w:t>
+      </w:r>
+      <w:proofErr w:type="spellStart"/>
+      <w:r>
+        <w:t>Extrude</w:t>
+      </w:r>
+      <w:proofErr w:type="spellEnd"/>
+      <w:r>
+        <w:t xml:space="preserve">, </w:t>
+      </w:r>
+      <w:proofErr w:type="spellStart"/>
+      <w:r>
+        <w:t>Scale</w:t>
+      </w:r>
+      <w:proofErr w:type="spellEnd"/>
+      <w:r>
+        <w:t xml:space="preserve"> и </w:t>
+      </w:r>
+      <w:proofErr w:type="spellStart"/>
+      <w:r>
+        <w:t>Fill</w:t>
+      </w:r>
+      <w:proofErr w:type="spellEnd"/>
+      <w:r>
+        <w:t>, итоговый результат на рис 2.</w:t>
       </w:r>
     </w:p>
     <w:p>
@@ -456,6 +485,11 @@
       </w:r>
     </w:p>
     <w:p>
+      <w:pPr>
+        <w:rPr>
+          <w:lang w:val="en-US"/>
+        </w:rPr>
+      </w:pPr>
       <w:r>
         <w:rPr>
           <w:noProof/>
@@ -499,6 +533,156 @@
     </w:p>
     <w:p>
       <w:pPr>
+        <w:rPr>
+          <w:lang w:val="en-US"/>
+        </w:rPr>
+      </w:pPr>
+      <w:r>
+        <w:rPr>
+          <w:noProof/>
+        </w:rPr>
+        <w:lastRenderedPageBreak/>
+        <w:drawing>
+          <wp:inline distT="0" distB="0" distL="0" distR="0" wp14:anchorId="3A6CCF2F" wp14:editId="0621CD9B">
+            <wp:extent cx="6152515" cy="2667000"/>
+            <wp:effectExtent l="0" t="0" r="635" b="0"/>
+            <wp:docPr id="8" name="Рисунок 8"/>
+            <wp:cNvGraphicFramePr>
+              <a:graphicFrameLocks xmlns:a="http://schemas.openxmlformats.org/drawingml/2006/main" noChangeAspect="1"/>
+            </wp:cNvGraphicFramePr>
+            <a:graphic xmlns:a="http://schemas.openxmlformats.org/drawingml/2006/main">
+              <a:graphicData uri="http://schemas.openxmlformats.org/drawingml/2006/picture">
+                <pic:pic xmlns:pic="http://schemas.openxmlformats.org/drawingml/2006/picture">
+                  <pic:nvPicPr>
+                    <pic:cNvPr id="1" name=""/>
+                    <pic:cNvPicPr/>
+                  </pic:nvPicPr>
+                  <pic:blipFill>
+                    <a:blip r:embed="rId15"/>
+                    <a:stretch>
+                      <a:fillRect/>
+                    </a:stretch>
+                  </pic:blipFill>
+                  <pic:spPr>
+                    <a:xfrm>
+                      <a:off x="0" y="0"/>
+                      <a:ext cx="6152515" cy="2667000"/>
+                    </a:xfrm>
+                    <a:prstGeom prst="rect">
+                      <a:avLst/>
+                    </a:prstGeom>
+                  </pic:spPr>
+                </pic:pic>
+              </a:graphicData>
+            </a:graphic>
+          </wp:inline>
+        </w:drawing>
+      </w:r>
+    </w:p>
+    <w:p>
+      <w:pPr>
+        <w:rPr>
+          <w:lang w:val="en-US"/>
+        </w:rPr>
+      </w:pPr>
+      <w:r>
+        <w:rPr>
+          <w:noProof/>
+        </w:rPr>
+        <w:drawing>
+          <wp:inline distT="0" distB="0" distL="0" distR="0" wp14:anchorId="2925E870" wp14:editId="2E52DB8B">
+            <wp:extent cx="3219048" cy="3438095"/>
+            <wp:effectExtent l="0" t="0" r="635" b="0"/>
+            <wp:docPr id="10" name="Рисунок 10"/>
+            <wp:cNvGraphicFramePr>
+              <a:graphicFrameLocks xmlns:a="http://schemas.openxmlformats.org/drawingml/2006/main" noChangeAspect="1"/>
+            </wp:cNvGraphicFramePr>
+            <a:graphic xmlns:a="http://schemas.openxmlformats.org/drawingml/2006/main">
+              <a:graphicData uri="http://schemas.openxmlformats.org/drawingml/2006/picture">
+                <pic:pic xmlns:pic="http://schemas.openxmlformats.org/drawingml/2006/picture">
+                  <pic:nvPicPr>
+                    <pic:cNvPr id="1" name=""/>
+                    <pic:cNvPicPr/>
+                  </pic:nvPicPr>
+                  <pic:blipFill>
+                    <a:blip r:embed="rId16"/>
+                    <a:stretch>
+                      <a:fillRect/>
+                    </a:stretch>
+                  </pic:blipFill>
+                  <pic:spPr>
+                    <a:xfrm>
+                      <a:off x="0" y="0"/>
+                      <a:ext cx="3219048" cy="3438095"/>
+                    </a:xfrm>
+                    <a:prstGeom prst="rect">
+                      <a:avLst/>
+                    </a:prstGeom>
+                  </pic:spPr>
+                </pic:pic>
+              </a:graphicData>
+            </a:graphic>
+          </wp:inline>
+        </w:drawing>
+      </w:r>
+    </w:p>
+    <w:p>
+      <w:pPr>
+        <w:rPr>
+          <w:lang w:val="en-US"/>
+        </w:rPr>
+      </w:pPr>
+      <w:r>
+        <w:rPr>
+          <w:noProof/>
+        </w:rPr>
+        <w:lastRenderedPageBreak/>
+        <w:drawing>
+          <wp:inline distT="0" distB="0" distL="0" distR="0" wp14:anchorId="62A3B010" wp14:editId="077DEA8E">
+            <wp:extent cx="6152515" cy="3308350"/>
+            <wp:effectExtent l="0" t="0" r="635" b="6350"/>
+            <wp:docPr id="11" name="Рисунок 11"/>
+            <wp:cNvGraphicFramePr>
+              <a:graphicFrameLocks xmlns:a="http://schemas.openxmlformats.org/drawingml/2006/main" noChangeAspect="1"/>
+            </wp:cNvGraphicFramePr>
+            <a:graphic xmlns:a="http://schemas.openxmlformats.org/drawingml/2006/main">
+              <a:graphicData uri="http://schemas.openxmlformats.org/drawingml/2006/picture">
+                <pic:pic xmlns:pic="http://schemas.openxmlformats.org/drawingml/2006/picture">
+                  <pic:nvPicPr>
+                    <pic:cNvPr id="1" name=""/>
+                    <pic:cNvPicPr/>
+                  </pic:nvPicPr>
+                  <pic:blipFill>
+                    <a:blip r:embed="rId17"/>
+                    <a:stretch>
+                      <a:fillRect/>
+                    </a:stretch>
+                  </pic:blipFill>
+                  <pic:spPr>
+                    <a:xfrm>
+                      <a:off x="0" y="0"/>
+                      <a:ext cx="6152515" cy="3308350"/>
+                    </a:xfrm>
+                    <a:prstGeom prst="rect">
+                      <a:avLst/>
+                    </a:prstGeom>
+                  </pic:spPr>
+                </pic:pic>
+              </a:graphicData>
+            </a:graphic>
+          </wp:inline>
+        </w:drawing>
+      </w:r>
+    </w:p>
+    <w:p>
+      <w:pPr>
+        <w:rPr>
+          <w:lang w:val="en-US"/>
+        </w:rPr>
+      </w:pPr>
+    </w:p>
+    <w:p>
+      <w:pPr>
         <w:pStyle w:val="1"/>
       </w:pPr>
       <w:r>
@@ -557,7 +741,15 @@
         </w:rPr>
       </w:pPr>
       <w:r>
-        <w:t>Цоколь и фасад здания были созданы из окружностей путём экструзии рёбер вдоль оси Z. Стенкам фасада придана толщина с помощью модификатора Solidify. Затем фасад установлен на цоколь через привязку по полигонам (рис. №).</w:t>
+        <w:t xml:space="preserve">Цоколь и фасад здания были созданы из окружностей путём экструзии рёбер вдоль оси Z. Стенкам фасада придана толщина с помощью модификатора </w:t>
+      </w:r>
+      <w:proofErr w:type="spellStart"/>
+      <w:r>
+        <w:t>Solidify</w:t>
+      </w:r>
+      <w:proofErr w:type="spellEnd"/>
+      <w:r>
+        <w:t>. Затем фасад установлен на цоколь через привязку по полигонам (рис. №).</w:t>
       </w:r>
     </w:p>
     <w:p>

</xml_diff>

<commit_message>
3d lab2: step 7
</commit_message>
<xml_diff>
--- a/4/3d_modeling/lab2/lab.docx
+++ b/4/3d_modeling/lab2/lab.docx
@@ -74,13 +74,8 @@
         <w:pStyle w:val="a2"/>
       </w:pPr>
       <w:r>
-        <w:t xml:space="preserve">9 </w:t>
-      </w:r>
-      <w:proofErr w:type="spellStart"/>
-      <w:r>
-        <w:t>шт</w:t>
-      </w:r>
-      <w:proofErr w:type="spellEnd"/>
+        <w:t>9 шт</w:t>
+      </w:r>
     </w:p>
     <w:p>
       <w:pPr>
@@ -272,31 +267,7 @@
         <w:pStyle w:val="a2"/>
       </w:pPr>
       <w:r>
-        <w:t xml:space="preserve">Фундамент создаётся при помощи инструментов </w:t>
-      </w:r>
-      <w:proofErr w:type="spellStart"/>
-      <w:r>
-        <w:t>Extrude</w:t>
-      </w:r>
-      <w:proofErr w:type="spellEnd"/>
-      <w:r>
-        <w:t xml:space="preserve">, </w:t>
-      </w:r>
-      <w:proofErr w:type="spellStart"/>
-      <w:r>
-        <w:t>Scale</w:t>
-      </w:r>
-      <w:proofErr w:type="spellEnd"/>
-      <w:r>
-        <w:t xml:space="preserve"> и </w:t>
-      </w:r>
-      <w:proofErr w:type="spellStart"/>
-      <w:r>
-        <w:t>Fill</w:t>
-      </w:r>
-      <w:proofErr w:type="spellEnd"/>
-      <w:r>
-        <w:t>, итоговый результат на рис 2.</w:t>
+        <w:t>Фундамент создаётся при помощи инструментов Extrude, Scale и Fill, итоговый результат на рис 2.</w:t>
       </w:r>
     </w:p>
     <w:p>
@@ -680,6 +651,46 @@
           <w:lang w:val="en-US"/>
         </w:rPr>
       </w:pPr>
+      <w:r>
+        <w:rPr>
+          <w:noProof/>
+        </w:rPr>
+        <w:drawing>
+          <wp:inline distT="0" distB="0" distL="0" distR="0" wp14:anchorId="6070C79F" wp14:editId="7DF3A22D">
+            <wp:extent cx="6152515" cy="3308350"/>
+            <wp:effectExtent l="0" t="0" r="635" b="6350"/>
+            <wp:docPr id="12" name="Рисунок 12"/>
+            <wp:cNvGraphicFramePr>
+              <a:graphicFrameLocks xmlns:a="http://schemas.openxmlformats.org/drawingml/2006/main" noChangeAspect="1"/>
+            </wp:cNvGraphicFramePr>
+            <a:graphic xmlns:a="http://schemas.openxmlformats.org/drawingml/2006/main">
+              <a:graphicData uri="http://schemas.openxmlformats.org/drawingml/2006/picture">
+                <pic:pic xmlns:pic="http://schemas.openxmlformats.org/drawingml/2006/picture">
+                  <pic:nvPicPr>
+                    <pic:cNvPr id="1" name=""/>
+                    <pic:cNvPicPr/>
+                  </pic:nvPicPr>
+                  <pic:blipFill>
+                    <a:blip r:embed="rId18"/>
+                    <a:stretch>
+                      <a:fillRect/>
+                    </a:stretch>
+                  </pic:blipFill>
+                  <pic:spPr>
+                    <a:xfrm>
+                      <a:off x="0" y="0"/>
+                      <a:ext cx="6152515" cy="3308350"/>
+                    </a:xfrm>
+                    <a:prstGeom prst="rect">
+                      <a:avLst/>
+                    </a:prstGeom>
+                  </pic:spPr>
+                </pic:pic>
+              </a:graphicData>
+            </a:graphic>
+          </wp:inline>
+        </w:drawing>
+      </w:r>
     </w:p>
     <w:p>
       <w:pPr>
@@ -741,15 +752,7 @@
         </w:rPr>
       </w:pPr>
       <w:r>
-        <w:t xml:space="preserve">Цоколь и фасад здания были созданы из окружностей путём экструзии рёбер вдоль оси Z. Стенкам фасада придана толщина с помощью модификатора </w:t>
-      </w:r>
-      <w:proofErr w:type="spellStart"/>
-      <w:r>
-        <w:t>Solidify</w:t>
-      </w:r>
-      <w:proofErr w:type="spellEnd"/>
-      <w:r>
-        <w:t>. Затем фасад установлен на цоколь через привязку по полигонам (рис. №).</w:t>
+        <w:t>Цоколь и фасад здания были созданы из окружностей путём экструзии рёбер вдоль оси Z. Стенкам фасада придана толщина с помощью модификатора Solidify. Затем фасад установлен на цоколь через привязку по полигонам (рис. №).</w:t>
       </w:r>
     </w:p>
     <w:p>

</xml_diff>

<commit_message>
3d lab2: step 8
</commit_message>
<xml_diff>
--- a/4/3d_modeling/lab2/lab.docx
+++ b/4/3d_modeling/lab2/lab.docx
@@ -672,6 +672,54 @@
                   </pic:nvPicPr>
                   <pic:blipFill>
                     <a:blip r:embed="rId18"/>
+                    <a:stretch>
+                      <a:fillRect/>
+                    </a:stretch>
+                  </pic:blipFill>
+                  <pic:spPr>
+                    <a:xfrm>
+                      <a:off x="0" y="0"/>
+                      <a:ext cx="6152515" cy="3308350"/>
+                    </a:xfrm>
+                    <a:prstGeom prst="rect">
+                      <a:avLst/>
+                    </a:prstGeom>
+                  </pic:spPr>
+                </pic:pic>
+              </a:graphicData>
+            </a:graphic>
+          </wp:inline>
+        </w:drawing>
+      </w:r>
+    </w:p>
+    <w:p>
+      <w:pPr>
+        <w:rPr>
+          <w:lang w:val="en-US"/>
+        </w:rPr>
+      </w:pPr>
+      <w:r>
+        <w:rPr>
+          <w:noProof/>
+        </w:rPr>
+        <w:lastRenderedPageBreak/>
+        <w:drawing>
+          <wp:inline distT="0" distB="0" distL="0" distR="0" wp14:anchorId="1CA7B168" wp14:editId="70E2CD39">
+            <wp:extent cx="6152515" cy="3308350"/>
+            <wp:effectExtent l="0" t="0" r="635" b="6350"/>
+            <wp:docPr id="13" name="Рисунок 13"/>
+            <wp:cNvGraphicFramePr>
+              <a:graphicFrameLocks xmlns:a="http://schemas.openxmlformats.org/drawingml/2006/main" noChangeAspect="1"/>
+            </wp:cNvGraphicFramePr>
+            <a:graphic xmlns:a="http://schemas.openxmlformats.org/drawingml/2006/main">
+              <a:graphicData uri="http://schemas.openxmlformats.org/drawingml/2006/picture">
+                <pic:pic xmlns:pic="http://schemas.openxmlformats.org/drawingml/2006/picture">
+                  <pic:nvPicPr>
+                    <pic:cNvPr id="1" name=""/>
+                    <pic:cNvPicPr/>
+                  </pic:nvPicPr>
+                  <pic:blipFill>
+                    <a:blip r:embed="rId19"/>
                     <a:stretch>
                       <a:fillRect/>
                     </a:stretch>

</xml_diff>

<commit_message>
3d lab2: step 9
</commit_message>
<xml_diff>
--- a/4/3d_modeling/lab2/lab.docx
+++ b/4/3d_modeling/lab2/lab.docx
@@ -693,11 +693,6 @@
       </w:r>
     </w:p>
     <w:p>
-      <w:pPr>
-        <w:rPr>
-          <w:lang w:val="en-US"/>
-        </w:rPr>
-      </w:pPr>
       <w:r>
         <w:rPr>
           <w:noProof/>
@@ -720,6 +715,186 @@
                   </pic:nvPicPr>
                   <pic:blipFill>
                     <a:blip r:embed="rId19"/>
+                    <a:stretch>
+                      <a:fillRect/>
+                    </a:stretch>
+                  </pic:blipFill>
+                  <pic:spPr>
+                    <a:xfrm>
+                      <a:off x="0" y="0"/>
+                      <a:ext cx="6152515" cy="3308350"/>
+                    </a:xfrm>
+                    <a:prstGeom prst="rect">
+                      <a:avLst/>
+                    </a:prstGeom>
+                  </pic:spPr>
+                </pic:pic>
+              </a:graphicData>
+            </a:graphic>
+          </wp:inline>
+        </w:drawing>
+      </w:r>
+    </w:p>
+    <w:p>
+      <w:r>
+        <w:rPr>
+          <w:noProof/>
+        </w:rPr>
+        <w:drawing>
+          <wp:inline distT="0" distB="0" distL="0" distR="0" wp14:anchorId="2E252AC4" wp14:editId="7BD60AF4">
+            <wp:extent cx="6152515" cy="3308350"/>
+            <wp:effectExtent l="0" t="0" r="635" b="6350"/>
+            <wp:docPr id="14" name="Рисунок 14"/>
+            <wp:cNvGraphicFramePr>
+              <a:graphicFrameLocks xmlns:a="http://schemas.openxmlformats.org/drawingml/2006/main" noChangeAspect="1"/>
+            </wp:cNvGraphicFramePr>
+            <a:graphic xmlns:a="http://schemas.openxmlformats.org/drawingml/2006/main">
+              <a:graphicData uri="http://schemas.openxmlformats.org/drawingml/2006/picture">
+                <pic:pic xmlns:pic="http://schemas.openxmlformats.org/drawingml/2006/picture">
+                  <pic:nvPicPr>
+                    <pic:cNvPr id="1" name=""/>
+                    <pic:cNvPicPr/>
+                  </pic:nvPicPr>
+                  <pic:blipFill>
+                    <a:blip r:embed="rId20"/>
+                    <a:stretch>
+                      <a:fillRect/>
+                    </a:stretch>
+                  </pic:blipFill>
+                  <pic:spPr>
+                    <a:xfrm>
+                      <a:off x="0" y="0"/>
+                      <a:ext cx="6152515" cy="3308350"/>
+                    </a:xfrm>
+                    <a:prstGeom prst="rect">
+                      <a:avLst/>
+                    </a:prstGeom>
+                  </pic:spPr>
+                </pic:pic>
+              </a:graphicData>
+            </a:graphic>
+          </wp:inline>
+        </w:drawing>
+      </w:r>
+    </w:p>
+    <w:p>
+      <w:r>
+        <w:rPr>
+          <w:noProof/>
+        </w:rPr>
+        <w:lastRenderedPageBreak/>
+        <w:drawing>
+          <wp:inline distT="0" distB="0" distL="0" distR="0" wp14:anchorId="3507438A" wp14:editId="129D8543">
+            <wp:extent cx="6152515" cy="3308350"/>
+            <wp:effectExtent l="0" t="0" r="635" b="6350"/>
+            <wp:docPr id="15" name="Рисунок 15"/>
+            <wp:cNvGraphicFramePr>
+              <a:graphicFrameLocks xmlns:a="http://schemas.openxmlformats.org/drawingml/2006/main" noChangeAspect="1"/>
+            </wp:cNvGraphicFramePr>
+            <a:graphic xmlns:a="http://schemas.openxmlformats.org/drawingml/2006/main">
+              <a:graphicData uri="http://schemas.openxmlformats.org/drawingml/2006/picture">
+                <pic:pic xmlns:pic="http://schemas.openxmlformats.org/drawingml/2006/picture">
+                  <pic:nvPicPr>
+                    <pic:cNvPr id="1" name=""/>
+                    <pic:cNvPicPr/>
+                  </pic:nvPicPr>
+                  <pic:blipFill>
+                    <a:blip r:embed="rId21"/>
+                    <a:stretch>
+                      <a:fillRect/>
+                    </a:stretch>
+                  </pic:blipFill>
+                  <pic:spPr>
+                    <a:xfrm>
+                      <a:off x="0" y="0"/>
+                      <a:ext cx="6152515" cy="3308350"/>
+                    </a:xfrm>
+                    <a:prstGeom prst="rect">
+                      <a:avLst/>
+                    </a:prstGeom>
+                  </pic:spPr>
+                </pic:pic>
+              </a:graphicData>
+            </a:graphic>
+          </wp:inline>
+        </w:drawing>
+      </w:r>
+    </w:p>
+    <w:p>
+      <w:pPr>
+        <w:rPr>
+          <w:lang w:val="en-US"/>
+        </w:rPr>
+      </w:pPr>
+      <w:r>
+        <w:rPr>
+          <w:noProof/>
+        </w:rPr>
+        <w:drawing>
+          <wp:inline distT="0" distB="0" distL="0" distR="0" wp14:anchorId="5C939121" wp14:editId="6AB24A29">
+            <wp:extent cx="6152515" cy="3308350"/>
+            <wp:effectExtent l="0" t="0" r="635" b="6350"/>
+            <wp:docPr id="16" name="Рисунок 16"/>
+            <wp:cNvGraphicFramePr>
+              <a:graphicFrameLocks xmlns:a="http://schemas.openxmlformats.org/drawingml/2006/main" noChangeAspect="1"/>
+            </wp:cNvGraphicFramePr>
+            <a:graphic xmlns:a="http://schemas.openxmlformats.org/drawingml/2006/main">
+              <a:graphicData uri="http://schemas.openxmlformats.org/drawingml/2006/picture">
+                <pic:pic xmlns:pic="http://schemas.openxmlformats.org/drawingml/2006/picture">
+                  <pic:nvPicPr>
+                    <pic:cNvPr id="1" name=""/>
+                    <pic:cNvPicPr/>
+                  </pic:nvPicPr>
+                  <pic:blipFill>
+                    <a:blip r:embed="rId22"/>
+                    <a:stretch>
+                      <a:fillRect/>
+                    </a:stretch>
+                  </pic:blipFill>
+                  <pic:spPr>
+                    <a:xfrm>
+                      <a:off x="0" y="0"/>
+                      <a:ext cx="6152515" cy="3308350"/>
+                    </a:xfrm>
+                    <a:prstGeom prst="rect">
+                      <a:avLst/>
+                    </a:prstGeom>
+                  </pic:spPr>
+                </pic:pic>
+              </a:graphicData>
+            </a:graphic>
+          </wp:inline>
+        </w:drawing>
+      </w:r>
+    </w:p>
+    <w:p>
+      <w:pPr>
+        <w:rPr>
+          <w:lang w:val="en-US"/>
+        </w:rPr>
+      </w:pPr>
+      <w:r>
+        <w:rPr>
+          <w:noProof/>
+        </w:rPr>
+        <w:lastRenderedPageBreak/>
+        <w:drawing>
+          <wp:inline distT="0" distB="0" distL="0" distR="0" wp14:anchorId="40A07A22" wp14:editId="7105586F">
+            <wp:extent cx="6152515" cy="3308350"/>
+            <wp:effectExtent l="0" t="0" r="635" b="6350"/>
+            <wp:docPr id="17" name="Рисунок 17"/>
+            <wp:cNvGraphicFramePr>
+              <a:graphicFrameLocks xmlns:a="http://schemas.openxmlformats.org/drawingml/2006/main" noChangeAspect="1"/>
+            </wp:cNvGraphicFramePr>
+            <a:graphic xmlns:a="http://schemas.openxmlformats.org/drawingml/2006/main">
+              <a:graphicData uri="http://schemas.openxmlformats.org/drawingml/2006/picture">
+                <pic:pic xmlns:pic="http://schemas.openxmlformats.org/drawingml/2006/picture">
+                  <pic:nvPicPr>
+                    <pic:cNvPr id="1" name=""/>
+                    <pic:cNvPicPr/>
+                  </pic:nvPicPr>
+                  <pic:blipFill>
+                    <a:blip r:embed="rId23"/>
                     <a:stretch>
                       <a:fillRect/>
                     </a:stretch>

</xml_diff>

<commit_message>
3d lab2: step 10
</commit_message>
<xml_diff>
--- a/4/3d_modeling/lab2/lab.docx
+++ b/4/3d_modeling/lab2/lab.docx
@@ -895,6 +895,53 @@
                   </pic:nvPicPr>
                   <pic:blipFill>
                     <a:blip r:embed="rId23"/>
+                    <a:stretch>
+                      <a:fillRect/>
+                    </a:stretch>
+                  </pic:blipFill>
+                  <pic:spPr>
+                    <a:xfrm>
+                      <a:off x="0" y="0"/>
+                      <a:ext cx="6152515" cy="3308350"/>
+                    </a:xfrm>
+                    <a:prstGeom prst="rect">
+                      <a:avLst/>
+                    </a:prstGeom>
+                  </pic:spPr>
+                </pic:pic>
+              </a:graphicData>
+            </a:graphic>
+          </wp:inline>
+        </w:drawing>
+      </w:r>
+    </w:p>
+    <w:p>
+      <w:pPr>
+        <w:rPr>
+          <w:lang w:val="en-US"/>
+        </w:rPr>
+      </w:pPr>
+      <w:r>
+        <w:rPr>
+          <w:noProof/>
+        </w:rPr>
+        <w:drawing>
+          <wp:inline distT="0" distB="0" distL="0" distR="0" wp14:anchorId="68FFD6BA" wp14:editId="0C2C8549">
+            <wp:extent cx="6152515" cy="3308350"/>
+            <wp:effectExtent l="0" t="0" r="635" b="6350"/>
+            <wp:docPr id="18" name="Рисунок 18"/>
+            <wp:cNvGraphicFramePr>
+              <a:graphicFrameLocks xmlns:a="http://schemas.openxmlformats.org/drawingml/2006/main" noChangeAspect="1"/>
+            </wp:cNvGraphicFramePr>
+            <a:graphic xmlns:a="http://schemas.openxmlformats.org/drawingml/2006/main">
+              <a:graphicData uri="http://schemas.openxmlformats.org/drawingml/2006/picture">
+                <pic:pic xmlns:pic="http://schemas.openxmlformats.org/drawingml/2006/picture">
+                  <pic:nvPicPr>
+                    <pic:cNvPr id="1" name=""/>
+                    <pic:cNvPicPr/>
+                  </pic:nvPicPr>
+                  <pic:blipFill>
+                    <a:blip r:embed="rId24"/>
                     <a:stretch>
                       <a:fillRect/>
                     </a:stretch>

</xml_diff>